<commit_message>
feat: add a grammar file
</commit_message>
<xml_diff>
--- a/42SI Stvorennja IDE/3/SI_KNT-122_Onyshchenko_19_PR3.docx
+++ b/42SI Stvorennja IDE/3/SI_KNT-122_Onyshchenko_19_PR3.docx
@@ -669,50 +669,521 @@
         </w:rPr>
         <w:t xml:space="preserve">2. </w:t>
       </w:r>
-    </w:p>
-    <w:p>
-      <w:pPr>
-        <w:pStyle w:val="p11"/>
-        <w:rPr>
-          <w:color w:val="auto"/>
-        </w:rPr>
-      </w:pPr>
-      <w:r>
-        <w:rPr>
-          <w:color w:val="auto"/>
-          <w:lang w:val="uk-UA"/>
-        </w:rPr>
-        <w:t>4. Виконати тестування побудованого синтаксичного аналізатора.</w:t>
-      </w:r>
-    </w:p>
-    <w:p>
-      <w:pPr>
-        <w:pStyle w:val="p11"/>
-        <w:rPr>
-          <w:color w:val="auto"/>
-        </w:rPr>
-      </w:pPr>
-      <w:r>
-        <w:rPr>
-          <w:color w:val="auto"/>
-          <w:lang w:val="uk-UA"/>
-        </w:rPr>
-        <w:t>5. Оформити звіт.</w:t>
-      </w:r>
-    </w:p>
-    <w:p>
-      <w:pPr>
-        <w:pStyle w:val="p11"/>
-        <w:rPr>
-          <w:color w:val="auto"/>
-        </w:rPr>
-      </w:pPr>
-      <w:r>
-        <w:rPr>
-          <w:color w:val="auto"/>
-          <w:lang w:val="uk-UA"/>
-        </w:rPr>
-        <w:t>6. Відповісти на контрольні питання.</w:t>
+      <w:r>
+        <w:rPr>
+          <w:color w:val="auto"/>
+          <w:lang w:val="uk-UA"/>
+        </w:rPr>
+        <w:t>Програмно реалізувати формування таблиці символів.</w:t>
+      </w:r>
+    </w:p>
+    <w:p>
+      <w:pPr>
+        <w:pStyle w:val="p11"/>
+        <w:rPr>
+          <w:color w:val="auto"/>
+        </w:rPr>
+      </w:pPr>
+      <w:r>
+        <w:rPr>
+          <w:color w:val="auto"/>
+          <w:lang w:val="uk-UA"/>
+        </w:rPr>
+        <w:t xml:space="preserve">3. Програмно реалізувати створення дерев проміжного представлення (вручну, додаючи відповідну функціональність у програму, або використовуючи в генераторі парсерів </w:t>
+      </w:r>
+      <w:r>
+        <w:rPr>
+          <w:color w:val="auto"/>
+          <w:lang w:val="en-US"/>
+        </w:rPr>
+        <w:t xml:space="preserve">ANTLR </w:t>
+      </w:r>
+      <w:r>
+        <w:rPr>
+          <w:color w:val="auto"/>
+          <w:lang w:val="uk-UA"/>
+        </w:rPr>
+        <w:t>при побудові граматики відповідної дії).</w:t>
+      </w:r>
+    </w:p>
+    <w:p>
+      <w:pPr>
+        <w:pStyle w:val="p11"/>
+        <w:rPr>
+          <w:color w:val="auto"/>
+        </w:rPr>
+      </w:pPr>
+      <w:r>
+        <w:rPr>
+          <w:color w:val="auto"/>
+          <w:lang w:val="uk-UA"/>
+        </w:rPr>
+        <w:t>4. Реалізувати виконання програмним забезпеченням перевірки зокрема наступних правил (у відповідності з індивідуальним завданням з додатку А, узгодженим з викладачем) та генерацію відповідних інформативних повідомлень (файл програми, номер рядка, позиція в рядку, текст повідомлення) у разі виявлення помилок:</w:t>
+      </w:r>
+    </w:p>
+    <w:p>
+      <w:pPr>
+        <w:pStyle w:val="p11"/>
+        <w:rPr>
+          <w:color w:val="auto"/>
+        </w:rPr>
+      </w:pPr>
+      <w:r>
+        <w:rPr>
+          <w:color w:val="auto"/>
+          <w:lang w:val="uk-UA"/>
+        </w:rPr>
+        <w:t>- жодний ідентифікатор (змінна, атрибут, функція, або метод) не оголошено двічі в одній області видимості;</w:t>
+      </w:r>
+    </w:p>
+    <w:p>
+      <w:pPr>
+        <w:pStyle w:val="p11"/>
+        <w:rPr>
+          <w:color w:val="auto"/>
+        </w:rPr>
+      </w:pPr>
+      <w:r>
+        <w:rPr>
+          <w:color w:val="auto"/>
+          <w:lang w:val="uk-UA"/>
+        </w:rPr>
+        <w:t>- жодний ідентифікатор (змінна, атрибут, функція або метод) не використано раніше ніж його оголошено в даній області видимості або без оголошення у ній;</w:t>
+      </w:r>
+    </w:p>
+    <w:p>
+      <w:pPr>
+        <w:pStyle w:val="p11"/>
+        <w:rPr>
+          <w:color w:val="auto"/>
+        </w:rPr>
+      </w:pPr>
+      <w:r>
+        <w:rPr>
+          <w:color w:val="auto"/>
+          <w:lang w:val="uk-UA"/>
+        </w:rPr>
+        <w:t xml:space="preserve">- кількість та тип фактичних аргументів у виклику функції (методу) має </w:t>
+      </w:r>
+      <w:r>
+        <w:rPr>
+          <w:color w:val="auto"/>
+          <w:lang w:val="uk-UA"/>
+        </w:rPr>
+        <w:t>бути такою ж як формальних параметрів у визначенні функції;</w:t>
+      </w:r>
+    </w:p>
+    <w:p>
+      <w:pPr>
+        <w:pStyle w:val="p11"/>
+        <w:rPr>
+          <w:color w:val="auto"/>
+        </w:rPr>
+      </w:pPr>
+      <w:r>
+        <w:rPr>
+          <w:color w:val="auto"/>
+          <w:lang w:val="uk-UA"/>
+        </w:rPr>
+        <w:t xml:space="preserve">- </w:t>
+      </w:r>
+      <w:r>
+        <w:rPr>
+          <w:color w:val="auto"/>
+          <w:lang w:val="uk-UA"/>
+        </w:rPr>
+        <w:t>при поверненні результати функцією значення має бути того ж типу, що і в оголошенні функції;</w:t>
+      </w:r>
+    </w:p>
+    <w:p>
+      <w:pPr>
+        <w:pStyle w:val="p11"/>
+        <w:rPr>
+          <w:color w:val="auto"/>
+        </w:rPr>
+      </w:pPr>
+      <w:r>
+        <w:rPr>
+          <w:color w:val="auto"/>
+          <w:lang w:val="uk-UA"/>
+        </w:rPr>
+        <w:t xml:space="preserve">- </w:t>
+      </w:r>
+      <w:r>
+        <w:rPr>
+          <w:color w:val="auto"/>
+          <w:lang w:val="uk-UA"/>
+        </w:rPr>
+        <w:t>методи та функції, які включені у вирази, мають повертати значення;</w:t>
+      </w:r>
+    </w:p>
+    <w:p>
+      <w:pPr>
+        <w:pStyle w:val="p11"/>
+        <w:rPr>
+          <w:color w:val="auto"/>
+          <w:lang w:val="uk-UA"/>
+        </w:rPr>
+      </w:pPr>
+      <w:r>
+        <w:rPr>
+          <w:color w:val="auto"/>
+          <w:lang w:val="uk-UA"/>
+        </w:rPr>
+        <w:t xml:space="preserve">- </w:t>
+      </w:r>
+      <w:r>
+        <w:rPr>
+          <w:color w:val="auto"/>
+          <w:lang w:val="uk-UA"/>
+        </w:rPr>
+        <w:t>керуючі оператори (</w:t>
+      </w:r>
+      <w:r>
+        <w:rPr>
+          <w:color w:val="auto"/>
+          <w:lang w:val="en-US"/>
+        </w:rPr>
+        <w:t xml:space="preserve">break, continue) </w:t>
+      </w:r>
+      <w:r>
+        <w:rPr>
+          <w:color w:val="auto"/>
+          <w:lang w:val="uk-UA"/>
+        </w:rPr>
+        <w:t>мають входити у тіло циклу;</w:t>
+      </w:r>
+    </w:p>
+    <w:p>
+      <w:pPr>
+        <w:pStyle w:val="p11"/>
+        <w:rPr>
+          <w:color w:val="auto"/>
+          <w:lang w:val="uk-UA"/>
+        </w:rPr>
+      </w:pPr>
+      <w:r>
+        <w:rPr>
+          <w:color w:val="auto"/>
+          <w:lang w:val="uk-UA"/>
+        </w:rPr>
+        <w:t xml:space="preserve">- </w:t>
+      </w:r>
+      <w:r>
+        <w:rPr>
+          <w:color w:val="auto"/>
+          <w:lang w:val="uk-UA"/>
+        </w:rPr>
+        <w:t>вираз, включений в умовний оператор, має бути логічного типу або перетворюватися у нього (у відповідності з правилами мови програмування);</w:t>
+      </w:r>
+    </w:p>
+    <w:p>
+      <w:pPr>
+        <w:pStyle w:val="p11"/>
+        <w:rPr>
+          <w:color w:val="auto"/>
+          <w:lang w:val="uk-UA"/>
+        </w:rPr>
+      </w:pPr>
+      <w:r>
+        <w:rPr>
+          <w:color w:val="auto"/>
+          <w:lang w:val="uk-UA"/>
+        </w:rPr>
+        <w:t xml:space="preserve">- </w:t>
+      </w:r>
+      <w:r>
+        <w:rPr>
+          <w:color w:val="auto"/>
+          <w:lang w:val="uk-UA"/>
+        </w:rPr>
+        <w:t>операнди операцій мають відповідати типам, для яких визначені дані операції;</w:t>
+      </w:r>
+    </w:p>
+    <w:p>
+      <w:pPr>
+        <w:pStyle w:val="p11"/>
+        <w:rPr>
+          <w:color w:val="auto"/>
+          <w:lang w:val="uk-UA"/>
+        </w:rPr>
+      </w:pPr>
+      <w:r>
+        <w:rPr>
+          <w:color w:val="auto"/>
+          <w:lang w:val="uk-UA"/>
+        </w:rPr>
+        <w:t xml:space="preserve">- </w:t>
+      </w:r>
+      <w:r>
+        <w:rPr>
+          <w:color w:val="auto"/>
+          <w:lang w:val="uk-UA"/>
+        </w:rPr>
+        <w:t>індекс масиву має бути цілочисельним;</w:t>
+      </w:r>
+    </w:p>
+    <w:p>
+      <w:pPr>
+        <w:pStyle w:val="p11"/>
+        <w:rPr>
+          <w:color w:val="auto"/>
+          <w:lang w:val="uk-UA"/>
+        </w:rPr>
+      </w:pPr>
+      <w:r>
+        <w:rPr>
+          <w:color w:val="auto"/>
+          <w:lang w:val="uk-UA"/>
+        </w:rPr>
+        <w:t xml:space="preserve">- </w:t>
+      </w:r>
+      <w:r>
+        <w:rPr>
+          <w:color w:val="auto"/>
+          <w:lang w:val="uk-UA"/>
+        </w:rPr>
+        <w:t>функції без типу не мають повертати значення;</w:t>
+      </w:r>
+    </w:p>
+    <w:p>
+      <w:pPr>
+        <w:pStyle w:val="p11"/>
+        <w:rPr>
+          <w:color w:val="auto"/>
+          <w:lang w:val="uk-UA"/>
+        </w:rPr>
+      </w:pPr>
+      <w:r>
+        <w:rPr>
+          <w:color w:val="auto"/>
+          <w:lang w:val="uk-UA"/>
+        </w:rPr>
+        <w:t xml:space="preserve">- </w:t>
+      </w:r>
+      <w:r>
+        <w:rPr>
+          <w:color w:val="auto"/>
+          <w:lang w:val="uk-UA"/>
+        </w:rPr>
+        <w:t>ієрархія класів (за умов їх присутності в граматиці мови) вірно побудована;</w:t>
+      </w:r>
+    </w:p>
+    <w:p>
+      <w:pPr>
+        <w:pStyle w:val="p11"/>
+        <w:rPr>
+          <w:color w:val="auto"/>
+          <w:lang w:val="uk-UA"/>
+        </w:rPr>
+      </w:pPr>
+      <w:r>
+        <w:rPr>
+          <w:color w:val="auto"/>
+          <w:lang w:val="uk-UA"/>
+        </w:rPr>
+        <w:t xml:space="preserve">- </w:t>
+      </w:r>
+      <w:r>
+        <w:rPr>
+          <w:color w:val="auto"/>
+          <w:lang w:val="uk-UA"/>
+        </w:rPr>
+        <w:t>зарезервовані ключові слова використано вірно.</w:t>
+      </w:r>
+    </w:p>
+    <w:p>
+      <w:pPr>
+        <w:pStyle w:val="p11"/>
+        <w:rPr>
+          <w:color w:val="auto"/>
+          <w:lang w:val="uk-UA"/>
+        </w:rPr>
+      </w:pPr>
+      <w:r>
+        <w:rPr>
+          <w:color w:val="auto"/>
+          <w:lang w:val="uk-UA"/>
+        </w:rPr>
+        <w:t>Семантичні перевірки повинні виконуватися згори вниз. Тільки перевірка типів у складі семантичних перевірок може виконуватись у протилежному напрямку.</w:t>
+      </w:r>
+    </w:p>
+    <w:p>
+      <w:pPr>
+        <w:pStyle w:val="p11"/>
+        <w:rPr>
+          <w:color w:val="auto"/>
+          <w:lang w:val="uk-UA"/>
+        </w:rPr>
+      </w:pPr>
+      <w:r>
+        <w:rPr>
+          <w:color w:val="auto"/>
+          <w:lang w:val="uk-UA"/>
+        </w:rPr>
+        <w:t>Усі виявлені помилки мають виводитись за один запуск.</w:t>
+      </w:r>
+    </w:p>
+    <w:p>
+      <w:pPr>
+        <w:pStyle w:val="p11"/>
+        <w:rPr>
+          <w:color w:val="auto"/>
+          <w:lang w:val="uk-UA"/>
+        </w:rPr>
+      </w:pPr>
+      <w:r>
+        <w:rPr>
+          <w:color w:val="auto"/>
+          <w:lang w:val="uk-UA"/>
+        </w:rPr>
+        <w:t>5. Розширити семантичний аналіз виведенням попереджень у разі виявлення наступних умов:</w:t>
+      </w:r>
+    </w:p>
+    <w:p>
+      <w:pPr>
+        <w:pStyle w:val="p11"/>
+        <w:rPr>
+          <w:color w:val="auto"/>
+          <w:lang w:val="uk-UA"/>
+        </w:rPr>
+      </w:pPr>
+      <w:r>
+        <w:rPr>
+          <w:color w:val="auto"/>
+          <w:lang w:val="uk-UA"/>
+        </w:rPr>
+        <w:t>- оголошена змінна не використовується жодного разу в програмі;</w:t>
+      </w:r>
+    </w:p>
+    <w:p>
+      <w:pPr>
+        <w:pStyle w:val="p11"/>
+        <w:rPr>
+          <w:color w:val="auto"/>
+          <w:lang w:val="uk-UA"/>
+        </w:rPr>
+      </w:pPr>
+      <w:r>
+        <w:rPr>
+          <w:color w:val="auto"/>
+          <w:lang w:val="uk-UA"/>
+        </w:rPr>
+        <w:t>- оператори циклу не передбачають завершення циклу;</w:t>
+      </w:r>
+    </w:p>
+    <w:p>
+      <w:pPr>
+        <w:pStyle w:val="p11"/>
+        <w:rPr>
+          <w:color w:val="auto"/>
+          <w:lang w:val="uk-UA"/>
+        </w:rPr>
+      </w:pPr>
+      <w:r>
+        <w:rPr>
+          <w:color w:val="auto"/>
+          <w:lang w:val="uk-UA"/>
+        </w:rPr>
+        <w:t>- умовні оператори не передбачають можливість руху всіма наявними своїми гілками.</w:t>
+      </w:r>
+    </w:p>
+    <w:p>
+      <w:pPr>
+        <w:pStyle w:val="p11"/>
+        <w:rPr>
+          <w:color w:val="auto"/>
+          <w:lang w:val="uk-UA"/>
+        </w:rPr>
+      </w:pPr>
+      <w:r>
+        <w:rPr>
+          <w:color w:val="auto"/>
+          <w:lang w:val="uk-UA"/>
+        </w:rPr>
+        <w:t>Усі виявленні попередження мають виводитись за один запуск.</w:t>
+      </w:r>
+    </w:p>
+    <w:p>
+      <w:pPr>
+        <w:pStyle w:val="p11"/>
+        <w:rPr>
+          <w:color w:val="auto"/>
+          <w:lang w:val="uk-UA"/>
+        </w:rPr>
+      </w:pPr>
+      <w:r>
+        <w:rPr>
+          <w:color w:val="auto"/>
+          <w:lang w:val="uk-UA"/>
+        </w:rPr>
+        <w:t>6. Відповідним чином модифікувати інтерфейс програмного забезпечення для виведення результатів виконання семантичного аналізу (пункти 2-5).</w:t>
+      </w:r>
+    </w:p>
+    <w:p>
+      <w:pPr>
+        <w:pStyle w:val="p11"/>
+        <w:rPr>
+          <w:color w:val="auto"/>
+        </w:rPr>
+      </w:pPr>
+      <w:r>
+        <w:rPr>
+          <w:color w:val="auto"/>
+          <w:lang w:val="uk-UA"/>
+        </w:rPr>
+        <w:t>7</w:t>
+      </w:r>
+      <w:r>
+        <w:rPr>
+          <w:color w:val="auto"/>
+          <w:lang w:val="uk-UA"/>
+        </w:rPr>
+        <w:t>. Виконати тестування побудованого синтаксичного аналізатора.</w:t>
+      </w:r>
+    </w:p>
+    <w:p>
+      <w:pPr>
+        <w:pStyle w:val="p11"/>
+        <w:rPr>
+          <w:color w:val="auto"/>
+        </w:rPr>
+      </w:pPr>
+      <w:r>
+        <w:rPr>
+          <w:color w:val="auto"/>
+          <w:lang w:val="uk-UA"/>
+        </w:rPr>
+        <w:t>8</w:t>
+      </w:r>
+      <w:r>
+        <w:rPr>
+          <w:color w:val="auto"/>
+          <w:lang w:val="uk-UA"/>
+        </w:rPr>
+        <w:t>. Оформити звіт.</w:t>
+      </w:r>
+    </w:p>
+    <w:p>
+      <w:pPr>
+        <w:pStyle w:val="p11"/>
+        <w:rPr>
+          <w:color w:val="auto"/>
+        </w:rPr>
+      </w:pPr>
+      <w:r>
+        <w:rPr>
+          <w:color w:val="auto"/>
+          <w:lang w:val="uk-UA"/>
+        </w:rPr>
+        <w:t>9</w:t>
+      </w:r>
+      <w:r>
+        <w:rPr>
+          <w:color w:val="auto"/>
+          <w:lang w:val="uk-UA"/>
+        </w:rPr>
+        <w:t>. Відповісти на контрольні питання.</w:t>
       </w:r>
     </w:p>
     <w:p>

</xml_diff>

<commit_message>
feat: just being done with it
</commit_message>
<xml_diff>
--- a/42SI Stvorennja IDE/3/SI_KNT-122_Onyshchenko_19_PR3.docx
+++ b/42SI Stvorennja IDE/3/SI_KNT-122_Onyshchenko_19_PR3.docx
@@ -9432,6 +9432,185 @@
           <w:color w:val="auto"/>
         </w:rPr>
         <w:t>Питання</w:t>
+      </w:r>
+    </w:p>
+    <w:p>
+      <w:pPr>
+        <w:pStyle w:val="H2"/>
+        <w:rPr/>
+      </w:pPr>
+      <w:r>
+        <w:rPr/>
+        <w:t>Які завдання виконуються на етапі семантичного аналізу?</w:t>
+      </w:r>
+    </w:p>
+    <w:p>
+      <w:pPr>
+        <w:pStyle w:val="P1"/>
+        <w:rPr/>
+      </w:pPr>
+      <w:r>
+        <w:rPr/>
+      </w:r>
+    </w:p>
+    <w:p>
+      <w:pPr>
+        <w:pStyle w:val="P1"/>
+        <w:rPr/>
+      </w:pPr>
+      <w:r>
+        <w:rPr/>
+        <w:t>Наступні задачі вирішуються на етапі семантичного аналізу:</w:t>
+      </w:r>
+    </w:p>
+    <w:p>
+      <w:pPr>
+        <w:pStyle w:val="P1"/>
+        <w:rPr/>
+      </w:pPr>
+      <w:r>
+        <w:rPr/>
+        <w:t>- перевірка типів;</w:t>
+      </w:r>
+    </w:p>
+    <w:p>
+      <w:pPr>
+        <w:pStyle w:val="P1"/>
+        <w:rPr/>
+      </w:pPr>
+      <w:r>
+        <w:rPr/>
+        <w:t>- контроль потоку керування;</w:t>
+      </w:r>
+    </w:p>
+    <w:p>
+      <w:pPr>
+        <w:pStyle w:val="P1"/>
+        <w:rPr/>
+      </w:pPr>
+      <w:r>
+        <w:rPr/>
+        <w:t>- аналіз функцій.</w:t>
+      </w:r>
+    </w:p>
+    <w:p>
+      <w:pPr>
+        <w:pStyle w:val="P1"/>
+        <w:rPr/>
+      </w:pPr>
+      <w:r>
+        <w:rPr/>
+      </w:r>
+    </w:p>
+    <w:p>
+      <w:pPr>
+        <w:pStyle w:val="H2"/>
+        <w:rPr/>
+      </w:pPr>
+      <w:r>
+        <w:rPr/>
+        <w:t>Яким чином виконується перевірка типів?</w:t>
+      </w:r>
+    </w:p>
+    <w:p>
+      <w:pPr>
+        <w:pStyle w:val="P1"/>
+        <w:rPr/>
+      </w:pPr>
+      <w:r>
+        <w:rPr/>
+      </w:r>
+    </w:p>
+    <w:p>
+      <w:pPr>
+        <w:pStyle w:val="P1"/>
+        <w:rPr/>
+      </w:pPr>
+      <w:r>
+        <w:rPr/>
+        <w:t xml:space="preserve">Листя дерева: визначаються тип константи, наприклад 5 це </w:t>
+      </w:r>
+      <w:r>
+        <w:rPr>
+          <w:lang w:val="en-US"/>
+        </w:rPr>
+        <w:t xml:space="preserve">i32, </w:t>
+      </w:r>
+      <w:r>
+        <w:rPr>
+          <w:lang w:val="uk-UA"/>
+        </w:rPr>
+        <w:t>"</w:t>
+      </w:r>
+      <w:r>
+        <w:rPr>
+          <w:lang w:val="en-US"/>
+        </w:rPr>
+        <w:t>string</w:t>
+      </w:r>
+      <w:r>
+        <w:rPr>
+          <w:lang w:val="uk-UA"/>
+        </w:rPr>
+        <w:t xml:space="preserve">" це </w:t>
+      </w:r>
+      <w:r>
+        <w:rPr>
+          <w:lang w:val="en-US"/>
+        </w:rPr>
+        <w:t>String.</w:t>
+      </w:r>
+    </w:p>
+    <w:p>
+      <w:pPr>
+        <w:pStyle w:val="P1"/>
+        <w:rPr>
+          <w:lang w:val="uk-UA"/>
+        </w:rPr>
+      </w:pPr>
+      <w:r>
+        <w:rPr>
+          <w:lang w:val="uk-UA"/>
+        </w:rPr>
+        <w:t>Підйом вгору: для кожного вузла аналізатор перевіряє типи його дітей.</w:t>
+      </w:r>
+    </w:p>
+    <w:p>
+      <w:pPr>
+        <w:pStyle w:val="P1"/>
+        <w:rPr/>
+      </w:pPr>
+      <w:r>
+        <w:rPr/>
+      </w:r>
+    </w:p>
+    <w:p>
+      <w:pPr>
+        <w:pStyle w:val="H2"/>
+        <w:rPr/>
+      </w:pPr>
+      <w:r>
+        <w:rPr/>
+        <w:t>Що таке таблиця символів та яка її структура?</w:t>
+      </w:r>
+    </w:p>
+    <w:p>
+      <w:pPr>
+        <w:pStyle w:val="P1"/>
+        <w:rPr/>
+      </w:pPr>
+      <w:r>
+        <w:rPr/>
+      </w:r>
+    </w:p>
+    <w:p>
+      <w:pPr>
+        <w:pStyle w:val="P1"/>
+        <w:rPr/>
+      </w:pPr>
+      <w:r>
+        <w:rPr/>
+        <w:t>Таблиця символів — це службова структура даних, яка зберігає всю інформацію про ідентифікатори в програмі.</w:t>
       </w:r>
     </w:p>
     <w:sectPr>

</xml_diff>